<commit_message>
Add Courses section with styling and multilingual support
</commit_message>
<xml_diff>
--- a/Testimonials.docx
+++ b/Testimonials.docx
@@ -910,7 +910,7 @@
           <w:bCs/>
           <w:lang w:val="en-FI"/>
         </w:rPr>
-        <w:t>diseñó</w:t>
+        <w:t>ha dise</w:t>
       </w:r>
       <w:r>
         <w:rPr>
@@ -935,7 +935,35 @@
           <w:bCs/>
           <w:lang w:val="en-FI"/>
         </w:rPr>
-        <w:t xml:space="preserve"> en www.guillermojacome.com</w:t>
+        <w:t xml:space="preserve"> en </w:t>
+      </w:r>
+      <w:hyperlink r:id="rId6" w:history="1">
+        <w:r>
+          <w:rPr>
+            <w:rStyle w:val="Hyperlink"/>
+            <w:b/>
+            <w:bCs/>
+            <w:lang w:val="en-FI"/>
+          </w:rPr>
+          <w:t>www.guillermojacome.com</w:t>
+        </w:r>
+      </w:hyperlink>
+    </w:p>
+    <w:p>
+      <w:pPr>
+        <w:rPr>
+          <w:b/>
+          <w:bCs/>
+          <w:lang w:val="en-FI"/>
+        </w:rPr>
+      </w:pPr>
+      <w:r>
+        <w:rPr>
+          <w:b/>
+          <w:bCs/>
+          <w:lang w:val="en-FI"/>
+        </w:rPr>
+        <w:t>"t4More": "¡Muchas gracias, bro! Lo pueden verificar en &lt;a href='https://www.guillermojacome.com' target='_blank' rel='noopener noreferrer'&gt;www.guillermojacome.com&lt;/a&gt;"</w:t>
       </w:r>
     </w:p>
     <w:p/>

</xml_diff>